<commit_message>
feat: Initialize Django project structure with core app, landing page, and basic settings
- Created core app with landing page view and URL routing.
- Added tests.py for future test cases.
- Set up main project settings, including database configuration and installed apps.
- Implemented WSGI and ASGI configurations for deployment.
- Added base HTML template with SEO metadata and Tailwind CSS integration.
- Initialized manage.py for command-line utility.
- Created SQLite database for local development.
</commit_message>
<xml_diff>
--- a/docs/01-requirements/Practicum_Project_Plan_Design_Implementation_Requirement_Analysis.docx
+++ b/docs/01-requirements/Practicum_Project_Plan_Design_Implementation_Requirement_Analysis.docx
@@ -43,15 +43,12 @@
         <w:ind w:firstLine="720"/>
       </w:pPr>
       <w:r>
-        <w:t>The system will be developed as a web-based application using a modular architecture. It consists of Authentication, User Manage</w:t>
+        <w:t>The system will be developed as a web-based applicat</w:t>
       </w:r>
       <w:bookmarkStart w:id="0" w:name="_GoBack"/>
       <w:bookmarkEnd w:id="0"/>
       <w:r>
-        <w:t xml:space="preserve">ment, Course </w:t>
-      </w:r>
-      <w:r>
-        <w:t>Management, Examination Management, OCR Processing, AI Evaluation Engine, Teacher Review, Reporting, and Analytics modules. The design follows a modular approach so that each component can be developed, tested, and maintained independently.</w:t>
+        <w:t>ion using a modular architecture. It consists of Authentication, User Management, Course Management, Examination Management, OCR Processing, AI Evaluation Engine, Teacher Review, Reporting, and Analytics modules. The design follows a modular approach so that each component can be developed, tested, and maintained independently.</w:t>
       </w:r>
     </w:p>
     <w:p>
@@ -59,10 +56,7 @@
         <w:pStyle w:val="Heading2"/>
       </w:pPr>
       <w:r>
-        <w:t>Proposal Implem</w:t>
-      </w:r>
-      <w:r>
-        <w:t>entation Details</w:t>
+        <w:t>Proposal Implementation Details</w:t>
       </w:r>
     </w:p>
     <w:p>
@@ -70,10 +64,7 @@
         <w:ind w:firstLine="720"/>
       </w:pPr>
       <w:r>
-        <w:t>The project will be implemented using Django, Django REST Framework, PostgreSQL, Tailwind CSS, Tesseract OCR, Gemini 2.5 Flash API, and Docker. The implementation process will begin with database design, followed by backend development, AI</w:t>
-      </w:r>
-      <w:r>
-        <w:t xml:space="preserve"> integration, frontend development, testing, and deployment.</w:t>
+        <w:t>The project will be implemented using Django, Django REST Framework, PostgreSQL, Tailwind CSS, Tesseract OCR, Gemini 2.5 Flash API, and Docker. The implementation process will begin with database design, followed by backend development, AI integration, frontend development, testing, and deployment.</w:t>
       </w:r>
     </w:p>
     <w:tbl>
@@ -191,10 +182,7 @@
           </w:tcPr>
           <w:p>
             <w:r>
-              <w:t>Unit testing</w:t>
-            </w:r>
-            <w:r>
-              <w:t>, integration testing, user testing</w:t>
+              <w:t>Unit testing, integration testing, user testing</w:t>
             </w:r>
           </w:p>
         </w:tc>
@@ -356,10 +344,7 @@
         <w:pStyle w:val="Heading2"/>
       </w:pPr>
       <w:r>
-        <w:t>Conclus</w:t>
-      </w:r>
-      <w:r>
-        <w:t>ion</w:t>
+        <w:t>Conclusion</w:t>
       </w:r>
     </w:p>
     <w:p>
@@ -368,6 +353,318 @@
       </w:pPr>
       <w:r>
         <w:t>IntelliGrade aims to improve the examination evaluation process by combining OCR and AI technologies while ensuring that teachers retain full control over the final grading decision.</w:t>
+      </w:r>
+    </w:p>
+    <w:p>
+      <w:r>
+        <w:br w:type="page"/>
+      </w:r>
+    </w:p>
+    <w:p>
+      <w:pPr>
+        <w:ind w:firstLine="720"/>
+        <w:rPr>
+          <w:noProof/>
+          <w:lang w:bidi="bn-BD"/>
+        </w:rPr>
+      </w:pPr>
+    </w:p>
+    <w:p>
+      <w:pPr>
+        <w:ind w:firstLine="720"/>
+      </w:pPr>
+      <w:r>
+        <w:rPr>
+          <w:noProof/>
+          <w:lang w:bidi="bn-BD"/>
+        </w:rPr>
+        <w:drawing>
+          <wp:inline distT="0" distB="0" distL="0" distR="0" wp14:anchorId="2CA04DFE" wp14:editId="75464130">
+            <wp:extent cx="5486400" cy="2436055"/>
+            <wp:effectExtent l="0" t="0" r="0" b="2540"/>
+            <wp:docPr id="1" name="Picture 1"/>
+            <wp:cNvGraphicFramePr>
+              <a:graphicFrameLocks xmlns:a="http://schemas.openxmlformats.org/drawingml/2006/main" noChangeAspect="1"/>
+            </wp:cNvGraphicFramePr>
+            <a:graphic xmlns:a="http://schemas.openxmlformats.org/drawingml/2006/main">
+              <a:graphicData uri="http://schemas.openxmlformats.org/drawingml/2006/picture">
+                <pic:pic xmlns:pic="http://schemas.openxmlformats.org/drawingml/2006/picture">
+                  <pic:nvPicPr>
+                    <pic:cNvPr id="0" name=""/>
+                    <pic:cNvPicPr/>
+                  </pic:nvPicPr>
+                  <pic:blipFill>
+                    <a:blip r:embed="rId7"/>
+                    <a:stretch>
+                      <a:fillRect/>
+                    </a:stretch>
+                  </pic:blipFill>
+                  <pic:spPr>
+                    <a:xfrm>
+                      <a:off x="0" y="0"/>
+                      <a:ext cx="5486400" cy="2436055"/>
+                    </a:xfrm>
+                    <a:prstGeom prst="rect">
+                      <a:avLst/>
+                    </a:prstGeom>
+                  </pic:spPr>
+                </pic:pic>
+              </a:graphicData>
+            </a:graphic>
+          </wp:inline>
+        </w:drawing>
+      </w:r>
+    </w:p>
+    <w:p>
+      <w:pPr>
+        <w:ind w:firstLine="720"/>
+      </w:pPr>
+    </w:p>
+    <w:p>
+      <w:pPr>
+        <w:ind w:firstLine="720"/>
+      </w:pPr>
+    </w:p>
+    <w:p>
+      <w:pPr>
+        <w:ind w:firstLine="720"/>
+      </w:pPr>
+    </w:p>
+    <w:p>
+      <w:pPr>
+        <w:ind w:firstLine="720"/>
+      </w:pPr>
+      <w:r>
+        <w:rPr>
+          <w:noProof/>
+          <w:lang w:bidi="bn-BD"/>
+        </w:rPr>
+        <w:drawing>
+          <wp:inline distT="0" distB="0" distL="0" distR="0" wp14:anchorId="48868AE8" wp14:editId="5643B0FD">
+            <wp:extent cx="5486400" cy="3215054"/>
+            <wp:effectExtent l="0" t="0" r="0" b="4445"/>
+            <wp:docPr id="2" name="Picture 2"/>
+            <wp:cNvGraphicFramePr>
+              <a:graphicFrameLocks xmlns:a="http://schemas.openxmlformats.org/drawingml/2006/main" noChangeAspect="1"/>
+            </wp:cNvGraphicFramePr>
+            <a:graphic xmlns:a="http://schemas.openxmlformats.org/drawingml/2006/main">
+              <a:graphicData uri="http://schemas.openxmlformats.org/drawingml/2006/picture">
+                <pic:pic xmlns:pic="http://schemas.openxmlformats.org/drawingml/2006/picture">
+                  <pic:nvPicPr>
+                    <pic:cNvPr id="0" name=""/>
+                    <pic:cNvPicPr/>
+                  </pic:nvPicPr>
+                  <pic:blipFill>
+                    <a:blip r:embed="rId8"/>
+                    <a:stretch>
+                      <a:fillRect/>
+                    </a:stretch>
+                  </pic:blipFill>
+                  <pic:spPr>
+                    <a:xfrm>
+                      <a:off x="0" y="0"/>
+                      <a:ext cx="5486400" cy="3215054"/>
+                    </a:xfrm>
+                    <a:prstGeom prst="rect">
+                      <a:avLst/>
+                    </a:prstGeom>
+                  </pic:spPr>
+                </pic:pic>
+              </a:graphicData>
+            </a:graphic>
+          </wp:inline>
+        </w:drawing>
+      </w:r>
+    </w:p>
+    <w:p>
+      <w:pPr>
+        <w:ind w:firstLine="720"/>
+      </w:pPr>
+    </w:p>
+    <w:p>
+      <w:pPr>
+        <w:ind w:firstLine="720"/>
+      </w:pPr>
+      <w:r>
+        <w:rPr>
+          <w:noProof/>
+          <w:lang w:bidi="bn-BD"/>
+        </w:rPr>
+        <w:lastRenderedPageBreak/>
+        <w:drawing>
+          <wp:inline distT="0" distB="0" distL="0" distR="0" wp14:anchorId="4F091991" wp14:editId="14551977">
+            <wp:extent cx="5486400" cy="2828192"/>
+            <wp:effectExtent l="0" t="0" r="0" b="0"/>
+            <wp:docPr id="4" name="Picture 4"/>
+            <wp:cNvGraphicFramePr>
+              <a:graphicFrameLocks xmlns:a="http://schemas.openxmlformats.org/drawingml/2006/main" noChangeAspect="1"/>
+            </wp:cNvGraphicFramePr>
+            <a:graphic xmlns:a="http://schemas.openxmlformats.org/drawingml/2006/main">
+              <a:graphicData uri="http://schemas.openxmlformats.org/drawingml/2006/picture">
+                <pic:pic xmlns:pic="http://schemas.openxmlformats.org/drawingml/2006/picture">
+                  <pic:nvPicPr>
+                    <pic:cNvPr id="0" name=""/>
+                    <pic:cNvPicPr/>
+                  </pic:nvPicPr>
+                  <pic:blipFill>
+                    <a:blip r:embed="rId9"/>
+                    <a:stretch>
+                      <a:fillRect/>
+                    </a:stretch>
+                  </pic:blipFill>
+                  <pic:spPr>
+                    <a:xfrm>
+                      <a:off x="0" y="0"/>
+                      <a:ext cx="5486400" cy="2828192"/>
+                    </a:xfrm>
+                    <a:prstGeom prst="rect">
+                      <a:avLst/>
+                    </a:prstGeom>
+                  </pic:spPr>
+                </pic:pic>
+              </a:graphicData>
+            </a:graphic>
+          </wp:inline>
+        </w:drawing>
+      </w:r>
+    </w:p>
+    <w:p>
+      <w:pPr>
+        <w:ind w:firstLine="720"/>
+      </w:pPr>
+      <w:r>
+        <w:rPr>
+          <w:noProof/>
+          <w:lang w:bidi="bn-BD"/>
+        </w:rPr>
+        <w:drawing>
+          <wp:inline distT="0" distB="0" distL="0" distR="0" wp14:anchorId="4AA143CB" wp14:editId="0AB23238">
+            <wp:extent cx="5486400" cy="3626534"/>
+            <wp:effectExtent l="0" t="0" r="0" b="0"/>
+            <wp:docPr id="3" name="Picture 3"/>
+            <wp:cNvGraphicFramePr>
+              <a:graphicFrameLocks xmlns:a="http://schemas.openxmlformats.org/drawingml/2006/main" noChangeAspect="1"/>
+            </wp:cNvGraphicFramePr>
+            <a:graphic xmlns:a="http://schemas.openxmlformats.org/drawingml/2006/main">
+              <a:graphicData uri="http://schemas.openxmlformats.org/drawingml/2006/picture">
+                <pic:pic xmlns:pic="http://schemas.openxmlformats.org/drawingml/2006/picture">
+                  <pic:nvPicPr>
+                    <pic:cNvPr id="0" name=""/>
+                    <pic:cNvPicPr/>
+                  </pic:nvPicPr>
+                  <pic:blipFill>
+                    <a:blip r:embed="rId10"/>
+                    <a:stretch>
+                      <a:fillRect/>
+                    </a:stretch>
+                  </pic:blipFill>
+                  <pic:spPr>
+                    <a:xfrm>
+                      <a:off x="0" y="0"/>
+                      <a:ext cx="5486400" cy="3626534"/>
+                    </a:xfrm>
+                    <a:prstGeom prst="rect">
+                      <a:avLst/>
+                    </a:prstGeom>
+                  </pic:spPr>
+                </pic:pic>
+              </a:graphicData>
+            </a:graphic>
+          </wp:inline>
+        </w:drawing>
+      </w:r>
+    </w:p>
+    <w:p>
+      <w:pPr>
+        <w:ind w:firstLine="720"/>
+      </w:pPr>
+      <w:r>
+        <w:rPr>
+          <w:noProof/>
+          <w:lang w:bidi="bn-BD"/>
+        </w:rPr>
+        <w:lastRenderedPageBreak/>
+        <w:drawing>
+          <wp:inline distT="0" distB="0" distL="0" distR="0" wp14:anchorId="0BDA649F" wp14:editId="07FC987E">
+            <wp:extent cx="5486400" cy="3482926"/>
+            <wp:effectExtent l="0" t="0" r="0" b="3810"/>
+            <wp:docPr id="6" name="Picture 6"/>
+            <wp:cNvGraphicFramePr>
+              <a:graphicFrameLocks xmlns:a="http://schemas.openxmlformats.org/drawingml/2006/main" noChangeAspect="1"/>
+            </wp:cNvGraphicFramePr>
+            <a:graphic xmlns:a="http://schemas.openxmlformats.org/drawingml/2006/main">
+              <a:graphicData uri="http://schemas.openxmlformats.org/drawingml/2006/picture">
+                <pic:pic xmlns:pic="http://schemas.openxmlformats.org/drawingml/2006/picture">
+                  <pic:nvPicPr>
+                    <pic:cNvPr id="0" name=""/>
+                    <pic:cNvPicPr/>
+                  </pic:nvPicPr>
+                  <pic:blipFill>
+                    <a:blip r:embed="rId11"/>
+                    <a:stretch>
+                      <a:fillRect/>
+                    </a:stretch>
+                  </pic:blipFill>
+                  <pic:spPr>
+                    <a:xfrm>
+                      <a:off x="0" y="0"/>
+                      <a:ext cx="5486400" cy="3482926"/>
+                    </a:xfrm>
+                    <a:prstGeom prst="rect">
+                      <a:avLst/>
+                    </a:prstGeom>
+                  </pic:spPr>
+                </pic:pic>
+              </a:graphicData>
+            </a:graphic>
+          </wp:inline>
+        </w:drawing>
+      </w:r>
+    </w:p>
+    <w:p>
+      <w:pPr>
+        <w:ind w:firstLine="720"/>
+      </w:pPr>
+      <w:r>
+        <w:rPr>
+          <w:noProof/>
+          <w:lang w:bidi="bn-BD"/>
+        </w:rPr>
+        <w:drawing>
+          <wp:inline distT="0" distB="0" distL="0" distR="0" wp14:anchorId="4AD00A29" wp14:editId="7BCA9B8A">
+            <wp:extent cx="5486400" cy="1703363"/>
+            <wp:effectExtent l="0" t="0" r="0" b="0"/>
+            <wp:docPr id="7" name="Picture 7"/>
+            <wp:cNvGraphicFramePr>
+              <a:graphicFrameLocks xmlns:a="http://schemas.openxmlformats.org/drawingml/2006/main" noChangeAspect="1"/>
+            </wp:cNvGraphicFramePr>
+            <a:graphic xmlns:a="http://schemas.openxmlformats.org/drawingml/2006/main">
+              <a:graphicData uri="http://schemas.openxmlformats.org/drawingml/2006/picture">
+                <pic:pic xmlns:pic="http://schemas.openxmlformats.org/drawingml/2006/picture">
+                  <pic:nvPicPr>
+                    <pic:cNvPr id="0" name=""/>
+                    <pic:cNvPicPr/>
+                  </pic:nvPicPr>
+                  <pic:blipFill>
+                    <a:blip r:embed="rId12"/>
+                    <a:stretch>
+                      <a:fillRect/>
+                    </a:stretch>
+                  </pic:blipFill>
+                  <pic:spPr>
+                    <a:xfrm>
+                      <a:off x="0" y="0"/>
+                      <a:ext cx="5486400" cy="1703363"/>
+                    </a:xfrm>
+                    <a:prstGeom prst="rect">
+                      <a:avLst/>
+                    </a:prstGeom>
+                  </pic:spPr>
+                </pic:pic>
+              </a:graphicData>
+            </a:graphic>
+          </wp:inline>
+        </w:drawing>
       </w:r>
     </w:p>
     <w:sectPr>
@@ -12426,6 +12723,36 @@
       </w:tcPr>
     </w:tblStylePr>
   </w:style>
+  <w:style w:type="paragraph" w:styleId="BalloonText">
+    <w:name w:val="Balloon Text"/>
+    <w:basedOn w:val="Normal"/>
+    <w:link w:val="BalloonTextChar"/>
+    <w:uiPriority w:val="99"/>
+    <w:semiHidden/>
+    <w:unhideWhenUsed/>
+    <w:rsid w:val="000C54F7"/>
+    <w:pPr>
+      <w:spacing w:after="0" w:line="240" w:lineRule="auto"/>
+    </w:pPr>
+    <w:rPr>
+      <w:rFonts w:ascii="Tahoma" w:hAnsi="Tahoma" w:cs="Tahoma"/>
+      <w:sz w:val="16"/>
+      <w:szCs w:val="16"/>
+    </w:rPr>
+  </w:style>
+  <w:style w:type="character" w:customStyle="1" w:styleId="BalloonTextChar">
+    <w:name w:val="Balloon Text Char"/>
+    <w:basedOn w:val="DefaultParagraphFont"/>
+    <w:link w:val="BalloonText"/>
+    <w:uiPriority w:val="99"/>
+    <w:semiHidden/>
+    <w:rsid w:val="000C54F7"/>
+    <w:rPr>
+      <w:rFonts w:ascii="Tahoma" w:hAnsi="Tahoma" w:cs="Tahoma"/>
+      <w:sz w:val="16"/>
+      <w:szCs w:val="16"/>
+    </w:rPr>
+  </w:style>
 </w:styles>
 </file>
 
@@ -24271,6 +24598,36 @@
         <w:shd w:val="clear" w:color="auto" w:fill="FBCAA2" w:themeFill="accent6" w:themeFillTint="7F"/>
       </w:tcPr>
     </w:tblStylePr>
+  </w:style>
+  <w:style w:type="paragraph" w:styleId="BalloonText">
+    <w:name w:val="Balloon Text"/>
+    <w:basedOn w:val="Normal"/>
+    <w:link w:val="BalloonTextChar"/>
+    <w:uiPriority w:val="99"/>
+    <w:semiHidden/>
+    <w:unhideWhenUsed/>
+    <w:rsid w:val="000C54F7"/>
+    <w:pPr>
+      <w:spacing w:after="0" w:line="240" w:lineRule="auto"/>
+    </w:pPr>
+    <w:rPr>
+      <w:rFonts w:ascii="Tahoma" w:hAnsi="Tahoma" w:cs="Tahoma"/>
+      <w:sz w:val="16"/>
+      <w:szCs w:val="16"/>
+    </w:rPr>
+  </w:style>
+  <w:style w:type="character" w:customStyle="1" w:styleId="BalloonTextChar">
+    <w:name w:val="Balloon Text Char"/>
+    <w:basedOn w:val="DefaultParagraphFont"/>
+    <w:link w:val="BalloonText"/>
+    <w:uiPriority w:val="99"/>
+    <w:semiHidden/>
+    <w:rsid w:val="000C54F7"/>
+    <w:rPr>
+      <w:rFonts w:ascii="Tahoma" w:hAnsi="Tahoma" w:cs="Tahoma"/>
+      <w:sz w:val="16"/>
+      <w:szCs w:val="16"/>
+    </w:rPr>
   </w:style>
 </w:styles>
 </file>
@@ -24600,7 +24957,7 @@
 </file>
 
 <file path=customXml/itemProps1.xml><?xml version="1.0" encoding="utf-8"?>
-<ds:datastoreItem xmlns:ds="http://schemas.openxmlformats.org/officeDocument/2006/customXml" ds:itemID="{6E77FFE4-A083-4601-9E1F-CEAACD13800A}">
+<ds:datastoreItem xmlns:ds="http://schemas.openxmlformats.org/officeDocument/2006/customXml" ds:itemID="{7120D5CE-3210-4509-8D88-5365E9487323}">
   <ds:schemaRefs>
     <ds:schemaRef ds:uri="http://schemas.openxmlformats.org/officeDocument/2006/bibliography"/>
   </ds:schemaRefs>

</xml_diff>